<commit_message>
Foreground complete species-level evidence
</commit_message>
<xml_diff>
--- a/manuscript/journal_submission/marine_environmental_research/rendered/mer_highlights_v2.docx
+++ b/manuscript/journal_submission/marine_environmental_research/rendered/mer_highlights_v2.docx
@@ -20,7 +20,7 @@
         </w:numPr>
       </w:pPr>
       <w:r>
-        <w:t xml:space="preserve">Herring spawning left a local but heterogeneous bird-checklist signature.</w:t>
+        <w:t xml:space="preserve">All 49 support-qualified species are shown, independent of prior literature.</w:t>
       </w:r>
     </w:p>
     <w:p>
@@ -32,7 +32,7 @@
         </w:numPr>
       </w:pPr>
       <w:r>
-        <w:t xml:space="preserve">Surf Scoter and Short-billed Gull responses recurred across both regions.</w:t>
+        <w:t xml:space="preserve">Common shore and sea birds had positive, negative, and mixed associations.</w:t>
       </w:r>
     </w:p>
     <w:p>

</xml_diff>